<commit_message>
CV: restore referees' details
Co-Authored-By: Claude Opus 5.5 <noreply@anthropic.com>
Claude-Session: https://claude.ai/code/session_01Jzv9QMHZsQu64D1eeJDQEW
</commit_message>
<xml_diff>
--- a/public/files/Malinga_Prabhath_CV.docx
+++ b/public/files/Malinga_Prabhath_CV.docx
@@ -1154,13 +1154,82 @@
       </w:r>
     </w:p>
     <w:p>
-      <w:r>
-        <w:rPr>
-          <w:rFonts w:ascii="Calibri" w:cs="Calibri" w:eastAsia="Calibri" w:hAnsi="Calibri"/>
-          <w:sz w:val="21"/>
-          <w:szCs w:val="21"/>
-        </w:rPr>
-        <w:t xml:space="preserve">Available on request.</w:t>
+      <w:pPr>
+        <w:spacing w:after="10"/>
+      </w:pPr>
+      <w:r>
+        <w:rPr>
+          <w:rFonts w:ascii="Calibri" w:cs="Calibri" w:eastAsia="Calibri" w:hAnsi="Calibri"/>
+          <w:b/>
+          <w:bCs/>
+          <w:sz w:val="21"/>
+          <w:szCs w:val="21"/>
+        </w:rPr>
+        <w:t xml:space="preserve">Dr. Kokila Ramanayake</w:t>
+      </w:r>
+    </w:p>
+    <w:p>
+      <w:pPr>
+        <w:spacing w:after="10"/>
+      </w:pPr>
+      <w:r>
+        <w:rPr>
+          <w:rFonts w:ascii="Calibri" w:cs="Calibri" w:eastAsia="Calibri" w:hAnsi="Calibri"/>
+          <w:sz w:val="21"/>
+          <w:szCs w:val="21"/>
+        </w:rPr>
+        <w:t xml:space="preserve">Head, Department of Information Technology, University of Ruhuna</w:t>
+      </w:r>
+    </w:p>
+    <w:p>
+      <w:pPr>
+        <w:spacing w:after="100"/>
+      </w:pPr>
+      <w:r>
+        <w:rPr>
+          <w:rFonts w:ascii="Calibri" w:cs="Calibri" w:eastAsia="Calibri" w:hAnsi="Calibri"/>
+          <w:sz w:val="21"/>
+          <w:szCs w:val="21"/>
+        </w:rPr>
+        <w:t xml:space="preserve">Phone: +94 71 683 0427</w:t>
+      </w:r>
+    </w:p>
+    <w:p>
+      <w:pPr>
+        <w:spacing w:after="10"/>
+      </w:pPr>
+      <w:r>
+        <w:rPr>
+          <w:rFonts w:ascii="Calibri" w:cs="Calibri" w:eastAsia="Calibri" w:hAnsi="Calibri"/>
+          <w:b/>
+          <w:bCs/>
+          <w:sz w:val="21"/>
+          <w:szCs w:val="21"/>
+        </w:rPr>
+        <w:t xml:space="preserve">Ms. Aysha Ashra</w:t>
+      </w:r>
+    </w:p>
+    <w:p>
+      <w:pPr>
+        <w:spacing w:after="10"/>
+      </w:pPr>
+      <w:r>
+        <w:rPr>
+          <w:rFonts w:ascii="Calibri" w:cs="Calibri" w:eastAsia="Calibri" w:hAnsi="Calibri"/>
+          <w:sz w:val="21"/>
+          <w:szCs w:val="21"/>
+        </w:rPr>
+        <w:t xml:space="preserve">Lecturer, University of Ruhuna</w:t>
+      </w:r>
+    </w:p>
+    <w:p>
+      <w:r>
+        <w:rPr>
+          <w:rFonts w:ascii="Calibri" w:cs="Calibri" w:eastAsia="Calibri" w:hAnsi="Calibri"/>
+          <w:sz w:val="21"/>
+          <w:szCs w:val="21"/>
+        </w:rPr>
+        <w:t xml:space="preserve">Phone: +94 77 449 6744</w:t>
       </w:r>
     </w:p>
     <w:sectPr>

</xml_diff>

<commit_message>
CV: clickable links for contact details, portfolio and projects
Co-Authored-By: Claude Opus 5.5 <noreply@anthropic.com>
Claude-Session: https://claude.ai/code/session_01Jzv9QMHZsQu64D1eeJDQEW
</commit_message>
<xml_diff>
--- a/public/files/Malinga_Prabhath_CV.docx
+++ b/public/files/Malinga_Prabhath_CV.docx
@@ -43,8 +43,40 @@
           <w:sz w:val="21"/>
           <w:szCs w:val="21"/>
         </w:rPr>
-        <w:t xml:space="preserve">Nugegoda, Sri Lanka | +94 77 423 4030 | malingaprabhath7@gmail.com</w:t>
-      </w:r>
+        <w:t xml:space="preserve">Nugegoda, Sri Lanka | </w:t>
+      </w:r>
+      <w:hyperlink w:history="1" r:id="rIdsm9lxhnnefkl4a0ag5qm6">
+        <w:r>
+          <w:rPr>
+            <w:rFonts w:ascii="Calibri" w:cs="Calibri" w:eastAsia="Calibri" w:hAnsi="Calibri"/>
+            <w:color w:val="1A56A6"/>
+            <w:sz w:val="21"/>
+            <w:szCs w:val="21"/>
+            <w:u w:val="single"/>
+          </w:rPr>
+          <w:t xml:space="preserve">+94 77 423 4030</w:t>
+        </w:r>
+      </w:hyperlink>
+      <w:r>
+        <w:rPr>
+          <w:rFonts w:ascii="Calibri" w:cs="Calibri" w:eastAsia="Calibri" w:hAnsi="Calibri"/>
+          <w:sz w:val="21"/>
+          <w:szCs w:val="21"/>
+        </w:rPr>
+        <w:t xml:space="preserve"> | </w:t>
+      </w:r>
+      <w:hyperlink w:history="1" r:id="rIdpuyh6o19msuskgmw8fptv">
+        <w:r>
+          <w:rPr>
+            <w:rFonts w:ascii="Calibri" w:cs="Calibri" w:eastAsia="Calibri" w:hAnsi="Calibri"/>
+            <w:color w:val="1A56A6"/>
+            <w:sz w:val="21"/>
+            <w:szCs w:val="21"/>
+            <w:u w:val="single"/>
+          </w:rPr>
+          <w:t xml:space="preserve">malingaprabhath7@gmail.com</w:t>
+        </w:r>
+      </w:hyperlink>
     </w:p>
     <w:p>
       <w:pPr>
@@ -57,8 +89,40 @@
           <w:sz w:val="21"/>
           <w:szCs w:val="21"/>
         </w:rPr>
-        <w:t xml:space="preserve">LinkedIn: linkedin.com/in/malinga-prabhath-0a85b7285 | GitHub: github.com/malingaprabhath7-maker</w:t>
-      </w:r>
+        <w:t xml:space="preserve">LinkedIn: </w:t>
+      </w:r>
+      <w:hyperlink w:history="1" r:id="rId1afvnesnk2mzillvv4_5v">
+        <w:r>
+          <w:rPr>
+            <w:rFonts w:ascii="Calibri" w:cs="Calibri" w:eastAsia="Calibri" w:hAnsi="Calibri"/>
+            <w:color w:val="1A56A6"/>
+            <w:sz w:val="21"/>
+            <w:szCs w:val="21"/>
+            <w:u w:val="single"/>
+          </w:rPr>
+          <w:t xml:space="preserve">linkedin.com/in/malinga-prabhath-0a85b7285</w:t>
+        </w:r>
+      </w:hyperlink>
+      <w:r>
+        <w:rPr>
+          <w:rFonts w:ascii="Calibri" w:cs="Calibri" w:eastAsia="Calibri" w:hAnsi="Calibri"/>
+          <w:sz w:val="21"/>
+          <w:szCs w:val="21"/>
+        </w:rPr>
+        <w:t xml:space="preserve"> | GitHub: </w:t>
+      </w:r>
+      <w:hyperlink w:history="1" r:id="rIdihp20unfgwcf4iyrrg8jh">
+        <w:r>
+          <w:rPr>
+            <w:rFonts w:ascii="Calibri" w:cs="Calibri" w:eastAsia="Calibri" w:hAnsi="Calibri"/>
+            <w:color w:val="1A56A6"/>
+            <w:sz w:val="21"/>
+            <w:szCs w:val="21"/>
+            <w:u w:val="single"/>
+          </w:rPr>
+          <w:t xml:space="preserve">github.com/malingaprabhath7-maker</w:t>
+        </w:r>
+      </w:hyperlink>
     </w:p>
     <w:p>
       <w:pPr>
@@ -71,8 +135,20 @@
           <w:sz w:val="21"/>
           <w:szCs w:val="21"/>
         </w:rPr>
-        <w:t xml:space="preserve">Portfolio: malingaprabhath7-maker.github.io/malinga-portfolio</w:t>
-      </w:r>
+        <w:t xml:space="preserve">Portfolio: </w:t>
+      </w:r>
+      <w:hyperlink w:history="1" r:id="rIdq8gtdqdnmtldugzqqklre">
+        <w:r>
+          <w:rPr>
+            <w:rFonts w:ascii="Calibri" w:cs="Calibri" w:eastAsia="Calibri" w:hAnsi="Calibri"/>
+            <w:color w:val="1A56A6"/>
+            <w:sz w:val="21"/>
+            <w:szCs w:val="21"/>
+            <w:u w:val="single"/>
+          </w:rPr>
+          <w:t xml:space="preserve">malingaprabhath7-maker.github.io/malinga-portfolio</w:t>
+        </w:r>
+      </w:hyperlink>
     </w:p>
     <w:p>
       <w:pPr>
@@ -557,6 +633,33 @@
     </w:p>
     <w:p>
       <w:pPr>
+        <w:spacing w:after="40"/>
+      </w:pPr>
+      <w:r>
+        <w:rPr>
+          <w:rFonts w:ascii="Calibri" w:cs="Calibri" w:eastAsia="Calibri" w:hAnsi="Calibri"/>
+          <w:b/>
+          <w:bCs/>
+          <w:sz w:val="21"/>
+          <w:szCs w:val="21"/>
+        </w:rPr>
+        <w:t xml:space="preserve">Link: </w:t>
+      </w:r>
+      <w:hyperlink w:history="1" r:id="rIdpmwgrzmx9lzovmg90zncw">
+        <w:r>
+          <w:rPr>
+            <w:rFonts w:ascii="Calibri" w:cs="Calibri" w:eastAsia="Calibri" w:hAnsi="Calibri"/>
+            <w:color w:val="1A56A6"/>
+            <w:sz w:val="21"/>
+            <w:szCs w:val="21"/>
+            <w:u w:val="single"/>
+          </w:rPr>
+          <w:t xml:space="preserve">Project page</w:t>
+        </w:r>
+      </w:hyperlink>
+    </w:p>
+    <w:p>
+      <w:pPr>
         <w:pStyle w:val="ListParagraph"/>
         <w:numPr>
           <w:ilvl w:val="0"/>
@@ -670,6 +773,33 @@
     </w:p>
     <w:p>
       <w:pPr>
+        <w:spacing w:after="40"/>
+      </w:pPr>
+      <w:r>
+        <w:rPr>
+          <w:rFonts w:ascii="Calibri" w:cs="Calibri" w:eastAsia="Calibri" w:hAnsi="Calibri"/>
+          <w:b/>
+          <w:bCs/>
+          <w:sz w:val="21"/>
+          <w:szCs w:val="21"/>
+        </w:rPr>
+        <w:t xml:space="preserve">Link: </w:t>
+      </w:r>
+      <w:hyperlink w:history="1" r:id="rIdo21f-khz_ssgiyuwdr7xc">
+        <w:r>
+          <w:rPr>
+            <w:rFonts w:ascii="Calibri" w:cs="Calibri" w:eastAsia="Calibri" w:hAnsi="Calibri"/>
+            <w:color w:val="1A56A6"/>
+            <w:sz w:val="21"/>
+            <w:szCs w:val="21"/>
+            <w:u w:val="single"/>
+          </w:rPr>
+          <w:t xml:space="preserve">github.com/malingaprabhath7-maker/Rakawaranaya</w:t>
+        </w:r>
+      </w:hyperlink>
+    </w:p>
+    <w:p>
+      <w:pPr>
         <w:pStyle w:val="ListParagraph"/>
         <w:numPr>
           <w:ilvl w:val="0"/>
@@ -747,6 +877,53 @@
     </w:p>
     <w:p>
       <w:pPr>
+        <w:spacing w:after="40"/>
+      </w:pPr>
+      <w:r>
+        <w:rPr>
+          <w:rFonts w:ascii="Calibri" w:cs="Calibri" w:eastAsia="Calibri" w:hAnsi="Calibri"/>
+          <w:b/>
+          <w:bCs/>
+          <w:sz w:val="21"/>
+          <w:szCs w:val="21"/>
+        </w:rPr>
+        <w:t xml:space="preserve">Link: </w:t>
+      </w:r>
+      <w:hyperlink w:history="1" r:id="rIdcuxm0qaz3br71mley3-vd">
+        <w:r>
+          <w:rPr>
+            <w:rFonts w:ascii="Calibri" w:cs="Calibri" w:eastAsia="Calibri" w:hAnsi="Calibri"/>
+            <w:color w:val="1A56A6"/>
+            <w:sz w:val="21"/>
+            <w:szCs w:val="21"/>
+            <w:u w:val="single"/>
+          </w:rPr>
+          <w:t xml:space="preserve">Live app</w:t>
+        </w:r>
+      </w:hyperlink>
+      <w:r>
+        <w:rPr>
+          <w:rFonts w:ascii="Calibri" w:cs="Calibri" w:eastAsia="Calibri" w:hAnsi="Calibri"/>
+          <w:sz w:val="21"/>
+          <w:szCs w:val="21"/>
+        </w:rPr>
+        <w:t xml:space="preserve"> | </w:t>
+      </w:r>
+      <w:hyperlink w:history="1" r:id="rIdmydq91xig12inh-yn49lm">
+        <w:r>
+          <w:rPr>
+            <w:rFonts w:ascii="Calibri" w:cs="Calibri" w:eastAsia="Calibri" w:hAnsi="Calibri"/>
+            <w:color w:val="1A56A6"/>
+            <w:sz w:val="21"/>
+            <w:szCs w:val="21"/>
+            <w:u w:val="single"/>
+          </w:rPr>
+          <w:t xml:space="preserve">Source code</w:t>
+        </w:r>
+      </w:hyperlink>
+    </w:p>
+    <w:p>
+      <w:pPr>
         <w:pStyle w:val="ListParagraph"/>
         <w:numPr>
           <w:ilvl w:val="0"/>
@@ -806,6 +983,33 @@
     </w:p>
     <w:p>
       <w:pPr>
+        <w:spacing w:after="40"/>
+      </w:pPr>
+      <w:r>
+        <w:rPr>
+          <w:rFonts w:ascii="Calibri" w:cs="Calibri" w:eastAsia="Calibri" w:hAnsi="Calibri"/>
+          <w:b/>
+          <w:bCs/>
+          <w:sz w:val="21"/>
+          <w:szCs w:val="21"/>
+        </w:rPr>
+        <w:t xml:space="preserve">Link: </w:t>
+      </w:r>
+      <w:hyperlink w:history="1" r:id="rIdyazpu2ppskm85mjtx922a">
+        <w:r>
+          <w:rPr>
+            <w:rFonts w:ascii="Calibri" w:cs="Calibri" w:eastAsia="Calibri" w:hAnsi="Calibri"/>
+            <w:color w:val="1A56A6"/>
+            <w:sz w:val="21"/>
+            <w:szCs w:val="21"/>
+            <w:u w:val="single"/>
+          </w:rPr>
+          <w:t xml:space="preserve">github.com/malingaprabhath7-maker/AgriAid</w:t>
+        </w:r>
+      </w:hyperlink>
+    </w:p>
+    <w:p>
+      <w:pPr>
         <w:pStyle w:val="ListParagraph"/>
         <w:numPr>
           <w:ilvl w:val="0"/>
@@ -865,6 +1069,53 @@
     </w:p>
     <w:p>
       <w:pPr>
+        <w:spacing w:after="40"/>
+      </w:pPr>
+      <w:r>
+        <w:rPr>
+          <w:rFonts w:ascii="Calibri" w:cs="Calibri" w:eastAsia="Calibri" w:hAnsi="Calibri"/>
+          <w:b/>
+          <w:bCs/>
+          <w:sz w:val="21"/>
+          <w:szCs w:val="21"/>
+        </w:rPr>
+        <w:t xml:space="preserve">Link: </w:t>
+      </w:r>
+      <w:hyperlink w:history="1" r:id="rIdi645xvo9phqqjh661uiwz">
+        <w:r>
+          <w:rPr>
+            <w:rFonts w:ascii="Calibri" w:cs="Calibri" w:eastAsia="Calibri" w:hAnsi="Calibri"/>
+            <w:color w:val="1A56A6"/>
+            <w:sz w:val="21"/>
+            <w:szCs w:val="21"/>
+            <w:u w:val="single"/>
+          </w:rPr>
+          <w:t xml:space="preserve">FAQ Chatbot</w:t>
+        </w:r>
+      </w:hyperlink>
+      <w:r>
+        <w:rPr>
+          <w:rFonts w:ascii="Calibri" w:cs="Calibri" w:eastAsia="Calibri" w:hAnsi="Calibri"/>
+          <w:sz w:val="21"/>
+          <w:szCs w:val="21"/>
+        </w:rPr>
+        <w:t xml:space="preserve"> | </w:t>
+      </w:r>
+      <w:hyperlink w:history="1" r:id="rIdowjyf4rj__4nv6a1rf2zk">
+        <w:r>
+          <w:rPr>
+            <w:rFonts w:ascii="Calibri" w:cs="Calibri" w:eastAsia="Calibri" w:hAnsi="Calibri"/>
+            <w:color w:val="1A56A6"/>
+            <w:sz w:val="21"/>
+            <w:szCs w:val="21"/>
+            <w:u w:val="single"/>
+          </w:rPr>
+          <w:t xml:space="preserve">Translation Tool</w:t>
+        </w:r>
+      </w:hyperlink>
+    </w:p>
+    <w:p>
+      <w:pPr>
         <w:pStyle w:val="ListParagraph"/>
         <w:numPr>
           <w:ilvl w:val="0"/>
@@ -908,14 +1159,101 @@
         </w:numPr>
         <w:spacing w:after="30"/>
       </w:pPr>
-      <w:r>
-        <w:rPr>
-          <w:rFonts w:ascii="Calibri" w:cs="Calibri" w:eastAsia="Calibri" w:hAnsi="Calibri"/>
-          <w:sz w:val="21"/>
-          <w:szCs w:val="21"/>
-        </w:rPr>
-        <w:t xml:space="preserve">EduBridge school LMS, an IoT smoke detection and fire alarm system, a native Android app, a Stress Management web app and the Travel Lanka tourism site.</w:t>
-      </w:r>
+      <w:hyperlink w:history="1" r:id="rIdwl_dlrz1e5gnn9aywc5wr">
+        <w:r>
+          <w:rPr>
+            <w:rFonts w:ascii="Calibri" w:cs="Calibri" w:eastAsia="Calibri" w:hAnsi="Calibri"/>
+            <w:color w:val="1A56A6"/>
+            <w:sz w:val="21"/>
+            <w:szCs w:val="21"/>
+            <w:u w:val="single"/>
+          </w:rPr>
+          <w:t xml:space="preserve">Calm Desk</w:t>
+        </w:r>
+      </w:hyperlink>
+      <w:r>
+        <w:rPr>
+          <w:rFonts w:ascii="Calibri" w:cs="Calibri" w:eastAsia="Calibri" w:hAnsi="Calibri"/>
+          <w:sz w:val="21"/>
+          <w:szCs w:val="21"/>
+        </w:rPr>
+        <w:t xml:space="preserve"> – bilingual stress-care web app with the PSS-10 stress check and relief exercises (live).</w:t>
+      </w:r>
+    </w:p>
+    <w:p>
+      <w:pPr>
+        <w:pStyle w:val="ListParagraph"/>
+        <w:numPr>
+          <w:ilvl w:val="0"/>
+          <w:numId w:val="2"/>
+        </w:numPr>
+        <w:spacing w:after="30"/>
+      </w:pPr>
+      <w:hyperlink w:history="1" r:id="rIdoeninerejbkeywloub4u7">
+        <w:r>
+          <w:rPr>
+            <w:rFonts w:ascii="Calibri" w:cs="Calibri" w:eastAsia="Calibri" w:hAnsi="Calibri"/>
+            <w:color w:val="1A56A6"/>
+            <w:sz w:val="21"/>
+            <w:szCs w:val="21"/>
+            <w:u w:val="single"/>
+          </w:rPr>
+          <w:t xml:space="preserve">Travel Lanka</w:t>
+        </w:r>
+      </w:hyperlink>
+      <w:r>
+        <w:rPr>
+          <w:rFonts w:ascii="Calibri" w:cs="Calibri" w:eastAsia="Calibri" w:hAnsi="Calibri"/>
+          <w:sz w:val="21"/>
+          <w:szCs w:val="21"/>
+        </w:rPr>
+        <w:t xml:space="preserve"> – bilingual Sri Lanka tour booking site built with Astro (live).</w:t>
+      </w:r>
+    </w:p>
+    <w:p>
+      <w:pPr>
+        <w:pStyle w:val="ListParagraph"/>
+        <w:numPr>
+          <w:ilvl w:val="0"/>
+          <w:numId w:val="2"/>
+        </w:numPr>
+        <w:spacing w:after="30"/>
+      </w:pPr>
+      <w:r>
+        <w:rPr>
+          <w:rFonts w:ascii="Calibri" w:cs="Calibri" w:eastAsia="Calibri" w:hAnsi="Calibri"/>
+          <w:sz w:val="21"/>
+          <w:szCs w:val="21"/>
+        </w:rPr>
+        <w:t xml:space="preserve">EduBridge school LMS, an IoT smoke detection and fire alarm system and a native Android app.</w:t>
+      </w:r>
+    </w:p>
+    <w:p>
+      <w:pPr>
+        <w:spacing w:after="30" w:before="40"/>
+      </w:pPr>
+      <w:r>
+        <w:rPr>
+          <w:rFonts w:ascii="Calibri" w:cs="Calibri" w:eastAsia="Calibri" w:hAnsi="Calibri"/>
+          <w:b/>
+          <w:bCs/>
+          <w:sz w:val="21"/>
+          <w:szCs w:val="21"/>
+        </w:rPr>
+        <w:t xml:space="preserve">All projects: </w:t>
+      </w:r>
+      <w:hyperlink w:history="1" r:id="rId53_mbrreip46a7nmzunzi">
+        <w:r>
+          <w:rPr>
+            <w:rFonts w:ascii="Calibri" w:cs="Calibri" w:eastAsia="Calibri" w:hAnsi="Calibri"/>
+            <w:color w:val="1A56A6"/>
+            <w:sz w:val="21"/>
+            <w:szCs w:val="21"/>
+            <w:u w:val="single"/>
+          </w:rPr>
+          <w:t xml:space="preserve">malingaprabhath7-maker.github.io/malinga-portfolio</w:t>
+        </w:r>
+      </w:hyperlink>
     </w:p>
     <w:p>
       <w:pPr>

</xml_diff>

<commit_message>
CV: link Rakawarana to its portfolio page
Co-Authored-By: Claude Opus 5.5 <noreply@anthropic.com>
Claude-Session: https://claude.ai/code/session_01Jzv9QMHZsQu64D1eeJDQEW
</commit_message>
<xml_diff>
--- a/public/files/Malinga_Prabhath_CV.docx
+++ b/public/files/Malinga_Prabhath_CV.docx
@@ -45,7 +45,7 @@
         </w:rPr>
         <w:t xml:space="preserve">Nugegoda, Sri Lanka | </w:t>
       </w:r>
-      <w:hyperlink w:history="1" r:id="rIdsm9lxhnnefkl4a0ag5qm6">
+      <w:hyperlink w:history="1" r:id="rIdxkdyirru9kywgfwz_wwap">
         <w:r>
           <w:rPr>
             <w:rFonts w:ascii="Calibri" w:cs="Calibri" w:eastAsia="Calibri" w:hAnsi="Calibri"/>
@@ -65,7 +65,7 @@
         </w:rPr>
         <w:t xml:space="preserve"> | </w:t>
       </w:r>
-      <w:hyperlink w:history="1" r:id="rIdpuyh6o19msuskgmw8fptv">
+      <w:hyperlink w:history="1" r:id="rIdiytnmqjstls0uapz-la7t">
         <w:r>
           <w:rPr>
             <w:rFonts w:ascii="Calibri" w:cs="Calibri" w:eastAsia="Calibri" w:hAnsi="Calibri"/>
@@ -91,7 +91,7 @@
         </w:rPr>
         <w:t xml:space="preserve">LinkedIn: </w:t>
       </w:r>
-      <w:hyperlink w:history="1" r:id="rId1afvnesnk2mzillvv4_5v">
+      <w:hyperlink w:history="1" r:id="rIdngiywlsfsn-a5earxsvve">
         <w:r>
           <w:rPr>
             <w:rFonts w:ascii="Calibri" w:cs="Calibri" w:eastAsia="Calibri" w:hAnsi="Calibri"/>
@@ -111,7 +111,7 @@
         </w:rPr>
         <w:t xml:space="preserve"> | GitHub: </w:t>
       </w:r>
-      <w:hyperlink w:history="1" r:id="rIdihp20unfgwcf4iyrrg8jh">
+      <w:hyperlink w:history="1" r:id="rIdg99mwuaz67tt115ofwltt">
         <w:r>
           <w:rPr>
             <w:rFonts w:ascii="Calibri" w:cs="Calibri" w:eastAsia="Calibri" w:hAnsi="Calibri"/>
@@ -137,7 +137,7 @@
         </w:rPr>
         <w:t xml:space="preserve">Portfolio: </w:t>
       </w:r>
-      <w:hyperlink w:history="1" r:id="rIdq8gtdqdnmtldugzqqklre">
+      <w:hyperlink w:history="1" r:id="rIdm8z4ufkc2gcckp39sag9u">
         <w:r>
           <w:rPr>
             <w:rFonts w:ascii="Calibri" w:cs="Calibri" w:eastAsia="Calibri" w:hAnsi="Calibri"/>
@@ -645,7 +645,7 @@
         </w:rPr>
         <w:t xml:space="preserve">Link: </w:t>
       </w:r>
-      <w:hyperlink w:history="1" r:id="rIdpmwgrzmx9lzovmg90zncw">
+      <w:hyperlink w:history="1" r:id="rIdlraltx0ghcn2trgq8goju">
         <w:r>
           <w:rPr>
             <w:rFonts w:ascii="Calibri" w:cs="Calibri" w:eastAsia="Calibri" w:hAnsi="Calibri"/>
@@ -785,7 +785,7 @@
         </w:rPr>
         <w:t xml:space="preserve">Link: </w:t>
       </w:r>
-      <w:hyperlink w:history="1" r:id="rIdo21f-khz_ssgiyuwdr7xc">
+      <w:hyperlink w:history="1" r:id="rIddhgxld0o8r0djizs_w3xd">
         <w:r>
           <w:rPr>
             <w:rFonts w:ascii="Calibri" w:cs="Calibri" w:eastAsia="Calibri" w:hAnsi="Calibri"/>
@@ -794,7 +794,7 @@
             <w:szCs w:val="21"/>
             <w:u w:val="single"/>
           </w:rPr>
-          <w:t xml:space="preserve">github.com/malingaprabhath7-maker/Rakawaranaya</w:t>
+          <w:t xml:space="preserve">Project page</w:t>
         </w:r>
       </w:hyperlink>
     </w:p>
@@ -889,7 +889,7 @@
         </w:rPr>
         <w:t xml:space="preserve">Link: </w:t>
       </w:r>
-      <w:hyperlink w:history="1" r:id="rIdcuxm0qaz3br71mley3-vd">
+      <w:hyperlink w:history="1" r:id="rId8vxp99pi43dyuqf4x2o9y">
         <w:r>
           <w:rPr>
             <w:rFonts w:ascii="Calibri" w:cs="Calibri" w:eastAsia="Calibri" w:hAnsi="Calibri"/>
@@ -909,7 +909,7 @@
         </w:rPr>
         <w:t xml:space="preserve"> | </w:t>
       </w:r>
-      <w:hyperlink w:history="1" r:id="rIdmydq91xig12inh-yn49lm">
+      <w:hyperlink w:history="1" r:id="rIduoxfb3kgbnsbi5chnhhn4">
         <w:r>
           <w:rPr>
             <w:rFonts w:ascii="Calibri" w:cs="Calibri" w:eastAsia="Calibri" w:hAnsi="Calibri"/>
@@ -995,7 +995,7 @@
         </w:rPr>
         <w:t xml:space="preserve">Link: </w:t>
       </w:r>
-      <w:hyperlink w:history="1" r:id="rIdyazpu2ppskm85mjtx922a">
+      <w:hyperlink w:history="1" r:id="rIdd2jjuu9pogciftq7u7poy">
         <w:r>
           <w:rPr>
             <w:rFonts w:ascii="Calibri" w:cs="Calibri" w:eastAsia="Calibri" w:hAnsi="Calibri"/>
@@ -1081,7 +1081,7 @@
         </w:rPr>
         <w:t xml:space="preserve">Link: </w:t>
       </w:r>
-      <w:hyperlink w:history="1" r:id="rIdi645xvo9phqqjh661uiwz">
+      <w:hyperlink w:history="1" r:id="rId9ttaugpwgb80d0t2urxk7">
         <w:r>
           <w:rPr>
             <w:rFonts w:ascii="Calibri" w:cs="Calibri" w:eastAsia="Calibri" w:hAnsi="Calibri"/>
@@ -1101,7 +1101,7 @@
         </w:rPr>
         <w:t xml:space="preserve"> | </w:t>
       </w:r>
-      <w:hyperlink w:history="1" r:id="rIdowjyf4rj__4nv6a1rf2zk">
+      <w:hyperlink w:history="1" r:id="rIda0m2rvi2s4u5ujj68kvsd">
         <w:r>
           <w:rPr>
             <w:rFonts w:ascii="Calibri" w:cs="Calibri" w:eastAsia="Calibri" w:hAnsi="Calibri"/>
@@ -1159,7 +1159,7 @@
         </w:numPr>
         <w:spacing w:after="30"/>
       </w:pPr>
-      <w:hyperlink w:history="1" r:id="rIdwl_dlrz1e5gnn9aywc5wr">
+      <w:hyperlink w:history="1" r:id="rIdap2jcpwfyymjqbrr2uuy9">
         <w:r>
           <w:rPr>
             <w:rFonts w:ascii="Calibri" w:cs="Calibri" w:eastAsia="Calibri" w:hAnsi="Calibri"/>
@@ -1189,7 +1189,7 @@
         </w:numPr>
         <w:spacing w:after="30"/>
       </w:pPr>
-      <w:hyperlink w:history="1" r:id="rIdoeninerejbkeywloub4u7">
+      <w:hyperlink w:history="1" r:id="rId3x7soxbct-hefjov71yoj">
         <w:r>
           <w:rPr>
             <w:rFonts w:ascii="Calibri" w:cs="Calibri" w:eastAsia="Calibri" w:hAnsi="Calibri"/>
@@ -1242,7 +1242,7 @@
         </w:rPr>
         <w:t xml:space="preserve">All projects: </w:t>
       </w:r>
-      <w:hyperlink w:history="1" r:id="rId53_mbrreip46a7nmzunzi">
+      <w:hyperlink w:history="1" r:id="rIdxjv3tkhmozwvdaas_wq7g">
         <w:r>
           <w:rPr>
             <w:rFonts w:ascii="Calibri" w:cs="Calibri" w:eastAsia="Calibri" w:hAnsi="Calibri"/>

</xml_diff>

<commit_message>
Add RASAS 2026 research abstract certificate; CV publications section
Co-Authored-By: Claude Opus 5.5 <noreply@anthropic.com>
Claude-Session: https://claude.ai/code/session_01Jzv9QMHZsQu64D1eeJDQEW
</commit_message>
<xml_diff>
--- a/public/files/Malinga_Prabhath_CV.docx
+++ b/public/files/Malinga_Prabhath_CV.docx
@@ -45,7 +45,7 @@
         </w:rPr>
         <w:t xml:space="preserve">Nugegoda, Sri Lanka | </w:t>
       </w:r>
-      <w:hyperlink w:history="1" r:id="rIdxkdyirru9kywgfwz_wwap">
+      <w:hyperlink w:history="1" r:id="rId1lun5ojrv4zoqf3afvb_x">
         <w:r>
           <w:rPr>
             <w:rFonts w:ascii="Calibri" w:cs="Calibri" w:eastAsia="Calibri" w:hAnsi="Calibri"/>
@@ -65,7 +65,7 @@
         </w:rPr>
         <w:t xml:space="preserve"> | </w:t>
       </w:r>
-      <w:hyperlink w:history="1" r:id="rIdiytnmqjstls0uapz-la7t">
+      <w:hyperlink w:history="1" r:id="rIdls94hfl5k9ywy5qs31o0q">
         <w:r>
           <w:rPr>
             <w:rFonts w:ascii="Calibri" w:cs="Calibri" w:eastAsia="Calibri" w:hAnsi="Calibri"/>
@@ -91,7 +91,7 @@
         </w:rPr>
         <w:t xml:space="preserve">LinkedIn: </w:t>
       </w:r>
-      <w:hyperlink w:history="1" r:id="rIdngiywlsfsn-a5earxsvve">
+      <w:hyperlink w:history="1" r:id="rIdjc5o41nizvpebitc98xml">
         <w:r>
           <w:rPr>
             <w:rFonts w:ascii="Calibri" w:cs="Calibri" w:eastAsia="Calibri" w:hAnsi="Calibri"/>
@@ -111,7 +111,7 @@
         </w:rPr>
         <w:t xml:space="preserve"> | GitHub: </w:t>
       </w:r>
-      <w:hyperlink w:history="1" r:id="rIdg99mwuaz67tt115ofwltt">
+      <w:hyperlink w:history="1" r:id="rIdapuf7mo23wwsihvwkfvwj">
         <w:r>
           <w:rPr>
             <w:rFonts w:ascii="Calibri" w:cs="Calibri" w:eastAsia="Calibri" w:hAnsi="Calibri"/>
@@ -137,7 +137,7 @@
         </w:rPr>
         <w:t xml:space="preserve">Portfolio: </w:t>
       </w:r>
-      <w:hyperlink w:history="1" r:id="rIdm8z4ufkc2gcckp39sag9u">
+      <w:hyperlink w:history="1" r:id="rIdqa5o2gniexypif7gkawox">
         <w:r>
           <w:rPr>
             <w:rFonts w:ascii="Calibri" w:cs="Calibri" w:eastAsia="Calibri" w:hAnsi="Calibri"/>
@@ -155,7 +155,7 @@
         <w:pBdr>
           <w:bottom w:val="single" w:color="1E4D3B" w:sz="6" w:space="2"/>
         </w:pBdr>
-        <w:spacing w:after="80" w:before="200"/>
+        <w:spacing w:after="70" w:before="160"/>
       </w:pPr>
       <w:r>
         <w:rPr>
@@ -187,7 +187,7 @@
         <w:pBdr>
           <w:bottom w:val="single" w:color="1E4D3B" w:sz="6" w:space="2"/>
         </w:pBdr>
-        <w:spacing w:after="80" w:before="200"/>
+        <w:spacing w:after="70" w:before="160"/>
       </w:pPr>
       <w:r>
         <w:rPr>
@@ -367,7 +367,7 @@
         <w:pBdr>
           <w:bottom w:val="single" w:color="1E4D3B" w:sz="6" w:space="2"/>
         </w:pBdr>
-        <w:spacing w:after="80" w:before="200"/>
+        <w:spacing w:after="70" w:before="160"/>
       </w:pPr>
       <w:r>
         <w:rPr>
@@ -576,7 +576,7 @@
         <w:pBdr>
           <w:bottom w:val="single" w:color="1E4D3B" w:sz="6" w:space="2"/>
         </w:pBdr>
-        <w:spacing w:after="80" w:before="200"/>
+        <w:spacing w:after="70" w:before="160"/>
       </w:pPr>
       <w:r>
         <w:rPr>
@@ -645,7 +645,7 @@
         </w:rPr>
         <w:t xml:space="preserve">Link: </w:t>
       </w:r>
-      <w:hyperlink w:history="1" r:id="rIdlraltx0ghcn2trgq8goju">
+      <w:hyperlink w:history="1" r:id="rIdil5w_iahxorx0vsqxlooc">
         <w:r>
           <w:rPr>
             <w:rFonts w:ascii="Calibri" w:cs="Calibri" w:eastAsia="Calibri" w:hAnsi="Calibri"/>
@@ -785,7 +785,7 @@
         </w:rPr>
         <w:t xml:space="preserve">Link: </w:t>
       </w:r>
-      <w:hyperlink w:history="1" r:id="rIddhgxld0o8r0djizs_w3xd">
+      <w:hyperlink w:history="1" r:id="rId5cvvtpwpyzdouutfvzhbn">
         <w:r>
           <w:rPr>
             <w:rFonts w:ascii="Calibri" w:cs="Calibri" w:eastAsia="Calibri" w:hAnsi="Calibri"/>
@@ -889,7 +889,7 @@
         </w:rPr>
         <w:t xml:space="preserve">Link: </w:t>
       </w:r>
-      <w:hyperlink w:history="1" r:id="rId8vxp99pi43dyuqf4x2o9y">
+      <w:hyperlink w:history="1" r:id="rId9y7yzhztjlyalgvn6xgl0">
         <w:r>
           <w:rPr>
             <w:rFonts w:ascii="Calibri" w:cs="Calibri" w:eastAsia="Calibri" w:hAnsi="Calibri"/>
@@ -909,7 +909,7 @@
         </w:rPr>
         <w:t xml:space="preserve"> | </w:t>
       </w:r>
-      <w:hyperlink w:history="1" r:id="rIduoxfb3kgbnsbi5chnhhn4">
+      <w:hyperlink w:history="1" r:id="rIdw7rjkq3cxbqtdb9kugbnr">
         <w:r>
           <w:rPr>
             <w:rFonts w:ascii="Calibri" w:cs="Calibri" w:eastAsia="Calibri" w:hAnsi="Calibri"/>
@@ -995,7 +995,7 @@
         </w:rPr>
         <w:t xml:space="preserve">Link: </w:t>
       </w:r>
-      <w:hyperlink w:history="1" r:id="rIdd2jjuu9pogciftq7u7poy">
+      <w:hyperlink w:history="1" r:id="rId5p8rln93q3hkydscfatgg">
         <w:r>
           <w:rPr>
             <w:rFonts w:ascii="Calibri" w:cs="Calibri" w:eastAsia="Calibri" w:hAnsi="Calibri"/>
@@ -1081,7 +1081,7 @@
         </w:rPr>
         <w:t xml:space="preserve">Link: </w:t>
       </w:r>
-      <w:hyperlink w:history="1" r:id="rId9ttaugpwgb80d0t2urxk7">
+      <w:hyperlink w:history="1" r:id="rIdeu8ucbjs4tillg6_xayjy">
         <w:r>
           <w:rPr>
             <w:rFonts w:ascii="Calibri" w:cs="Calibri" w:eastAsia="Calibri" w:hAnsi="Calibri"/>
@@ -1101,7 +1101,7 @@
         </w:rPr>
         <w:t xml:space="preserve"> | </w:t>
       </w:r>
-      <w:hyperlink w:history="1" r:id="rIda0m2rvi2s4u5ujj68kvsd">
+      <w:hyperlink w:history="1" r:id="rId7uq7pwqnqm_m2dnruoxfb">
         <w:r>
           <w:rPr>
             <w:rFonts w:ascii="Calibri" w:cs="Calibri" w:eastAsia="Calibri" w:hAnsi="Calibri"/>
@@ -1159,7 +1159,7 @@
         </w:numPr>
         <w:spacing w:after="30"/>
       </w:pPr>
-      <w:hyperlink w:history="1" r:id="rIdap2jcpwfyymjqbrr2uuy9">
+      <w:hyperlink w:history="1" r:id="rIdgmsgjvtk1tnmmj9uvdrw5">
         <w:r>
           <w:rPr>
             <w:rFonts w:ascii="Calibri" w:cs="Calibri" w:eastAsia="Calibri" w:hAnsi="Calibri"/>
@@ -1189,7 +1189,7 @@
         </w:numPr>
         <w:spacing w:after="30"/>
       </w:pPr>
-      <w:hyperlink w:history="1" r:id="rId3x7soxbct-hefjov71yoj">
+      <w:hyperlink w:history="1" r:id="rIdrl8twrbjpuvfyla763qgm">
         <w:r>
           <w:rPr>
             <w:rFonts w:ascii="Calibri" w:cs="Calibri" w:eastAsia="Calibri" w:hAnsi="Calibri"/>
@@ -1219,13 +1219,43 @@
         </w:numPr>
         <w:spacing w:after="30"/>
       </w:pPr>
-      <w:r>
-        <w:rPr>
-          <w:rFonts w:ascii="Calibri" w:cs="Calibri" w:eastAsia="Calibri" w:hAnsi="Calibri"/>
-          <w:sz w:val="21"/>
-          <w:szCs w:val="21"/>
-        </w:rPr>
-        <w:t xml:space="preserve">EduBridge school LMS, an IoT smoke detection and fire alarm system and a native Android app.</w:t>
+      <w:hyperlink w:history="1" r:id="rIdyla3cg75whl8ind50u3h2">
+        <w:r>
+          <w:rPr>
+            <w:rFonts w:ascii="Calibri" w:cs="Calibri" w:eastAsia="Calibri" w:hAnsi="Calibri"/>
+            <w:color w:val="1A56A6"/>
+            <w:sz w:val="21"/>
+            <w:szCs w:val="21"/>
+            <w:u w:val="single"/>
+          </w:rPr>
+          <w:t xml:space="preserve">Ceyloncraft</w:t>
+        </w:r>
+      </w:hyperlink>
+      <w:r>
+        <w:rPr>
+          <w:rFonts w:ascii="Calibri" w:cs="Calibri" w:eastAsia="Calibri" w:hAnsi="Calibri"/>
+          <w:sz w:val="21"/>
+          <w:szCs w:val="21"/>
+        </w:rPr>
+        <w:t xml:space="preserve"> – bilingual craft store with WhatsApp checkout and a Firebase admin panel (live demo).</w:t>
+      </w:r>
+    </w:p>
+    <w:p>
+      <w:pPr>
+        <w:pStyle w:val="ListParagraph"/>
+        <w:numPr>
+          <w:ilvl w:val="0"/>
+          <w:numId w:val="2"/>
+        </w:numPr>
+        <w:spacing w:after="30"/>
+      </w:pPr>
+      <w:r>
+        <w:rPr>
+          <w:rFonts w:ascii="Calibri" w:cs="Calibri" w:eastAsia="Calibri" w:hAnsi="Calibri"/>
+          <w:sz w:val="21"/>
+          <w:szCs w:val="21"/>
+        </w:rPr>
+        <w:t xml:space="preserve">EduBridge, a web-based school management system (research abstract at RASAS 2026), an IoT smoke detection and fire alarm system and a native Android app.</w:t>
       </w:r>
     </w:p>
     <w:p>
@@ -1242,7 +1272,7 @@
         </w:rPr>
         <w:t xml:space="preserve">All projects: </w:t>
       </w:r>
-      <w:hyperlink w:history="1" r:id="rIdxjv3tkhmozwvdaas_wq7g">
+      <w:hyperlink w:history="1" r:id="rIduoaa2ppgz_lm2wwee_kdp">
         <w:r>
           <w:rPr>
             <w:rFonts w:ascii="Calibri" w:cs="Calibri" w:eastAsia="Calibri" w:hAnsi="Calibri"/>
@@ -1260,7 +1290,57 @@
         <w:pBdr>
           <w:bottom w:val="single" w:color="1E4D3B" w:sz="6" w:space="2"/>
         </w:pBdr>
-        <w:spacing w:after="80" w:before="200"/>
+        <w:spacing w:after="70" w:before="160"/>
+      </w:pPr>
+      <w:r>
+        <w:rPr>
+          <w:rFonts w:ascii="Calibri" w:cs="Calibri" w:eastAsia="Calibri" w:hAnsi="Calibri"/>
+          <w:b/>
+          <w:bCs/>
+          <w:color w:val="1E4D3B"/>
+          <w:sz w:val="23"/>
+          <w:szCs w:val="23"/>
+        </w:rPr>
+        <w:t xml:space="preserve">PUBLICATIONS</w:t>
+      </w:r>
+    </w:p>
+    <w:p>
+      <w:pPr>
+        <w:spacing w:after="40"/>
+      </w:pPr>
+      <w:r>
+        <w:rPr>
+          <w:rFonts w:ascii="Calibri" w:cs="Calibri" w:eastAsia="Calibri" w:hAnsi="Calibri"/>
+          <w:sz w:val="21"/>
+          <w:szCs w:val="21"/>
+        </w:rPr>
+        <w:t xml:space="preserve">Co-author. </w:t>
+      </w:r>
+      <w:r>
+        <w:rPr>
+          <w:rFonts w:ascii="Calibri" w:cs="Calibri" w:eastAsia="Calibri" w:hAnsi="Calibri"/>
+          <w:i/>
+          <w:iCs/>
+          <w:sz w:val="21"/>
+          <w:szCs w:val="21"/>
+        </w:rPr>
+        <w:t xml:space="preserve">“EduBridge: A Simplified Web-Based School Management System for Digital Transformation in Sri Lankan Schools.”</w:t>
+      </w:r>
+      <w:r>
+        <w:rPr>
+          <w:rFonts w:ascii="Calibri" w:cs="Calibri" w:eastAsia="Calibri" w:hAnsi="Calibri"/>
+          <w:sz w:val="21"/>
+          <w:szCs w:val="21"/>
+        </w:rPr>
+        <w:t xml:space="preserve"> Abstract, 11th Ruhuna Arts Students’ Annual Sessions (RASAS 2026), Department of Information Technology, University of Ruhuna, 29 October 2026.</w:t>
+      </w:r>
+    </w:p>
+    <w:p>
+      <w:pPr>
+        <w:pBdr>
+          <w:bottom w:val="single" w:color="1E4D3B" w:sz="6" w:space="2"/>
+        </w:pBdr>
+        <w:spacing w:after="70" w:before="160"/>
       </w:pPr>
       <w:r>
         <w:rPr>
@@ -1393,7 +1473,7 @@
         <w:pBdr>
           <w:bottom w:val="single" w:color="1E4D3B" w:sz="6" w:space="2"/>
         </w:pBdr>
-        <w:spacing w:after="80" w:before="200"/>
+        <w:spacing w:after="70" w:before="160"/>
       </w:pPr>
       <w:r>
         <w:rPr>
@@ -1448,7 +1528,7 @@
         <w:pBdr>
           <w:bottom w:val="single" w:color="1E4D3B" w:sz="6" w:space="2"/>
         </w:pBdr>
-        <w:spacing w:after="80" w:before="200"/>
+        <w:spacing w:after="70" w:before="160"/>
       </w:pPr>
       <w:r>
         <w:rPr>
@@ -1477,7 +1557,7 @@
         <w:pBdr>
           <w:bottom w:val="single" w:color="1E4D3B" w:sz="6" w:space="2"/>
         </w:pBdr>
-        <w:spacing w:after="80" w:before="200"/>
+        <w:spacing w:after="70" w:before="160"/>
       </w:pPr>
       <w:r>
         <w:rPr>
@@ -1572,7 +1652,7 @@
     </w:p>
     <w:sectPr>
       <w:pgSz w:w="11906" w:h="16838" w:orient="portrait"/>
-      <w:pgMar w:top="720" w:right="720" w:bottom="720" w:left="720" w:header="708" w:footer="708" w:gutter="0"/>
+      <w:pgMar w:top="640" w:right="720" w:bottom="600" w:left="720" w:header="708" w:footer="708" w:gutter="0"/>
       <w:pgNumType/>
       <w:docGrid w:linePitch="360"/>
     </w:sectPr>

</xml_diff>

<commit_message>
CV: correct reference name to Dr. Kokila Ramanayaka
Co-Authored-By: Claude Opus 5.5 <noreply@anthropic.com>
Claude-Session: https://claude.ai/code/session_01Jzv9QMHZsQu64D1eeJDQEW
</commit_message>
<xml_diff>
--- a/public/files/Malinga_Prabhath_CV.docx
+++ b/public/files/Malinga_Prabhath_CV.docx
@@ -45,7 +45,7 @@
         </w:rPr>
         <w:t xml:space="preserve">Nugegoda, Sri Lanka | </w:t>
       </w:r>
-      <w:hyperlink w:history="1" r:id="rId1lun5ojrv4zoqf3afvb_x">
+      <w:hyperlink w:history="1" r:id="rIdpt_odkzb3inuprz-drpvc">
         <w:r>
           <w:rPr>
             <w:rFonts w:ascii="Calibri" w:cs="Calibri" w:eastAsia="Calibri" w:hAnsi="Calibri"/>
@@ -65,7 +65,7 @@
         </w:rPr>
         <w:t xml:space="preserve"> | </w:t>
       </w:r>
-      <w:hyperlink w:history="1" r:id="rIdls94hfl5k9ywy5qs31o0q">
+      <w:hyperlink w:history="1" r:id="rId8vwlbtemuo7m6klb3rmnz">
         <w:r>
           <w:rPr>
             <w:rFonts w:ascii="Calibri" w:cs="Calibri" w:eastAsia="Calibri" w:hAnsi="Calibri"/>
@@ -91,7 +91,7 @@
         </w:rPr>
         <w:t xml:space="preserve">LinkedIn: </w:t>
       </w:r>
-      <w:hyperlink w:history="1" r:id="rIdjc5o41nizvpebitc98xml">
+      <w:hyperlink w:history="1" r:id="rId6swqqatzabquab11gnfkm">
         <w:r>
           <w:rPr>
             <w:rFonts w:ascii="Calibri" w:cs="Calibri" w:eastAsia="Calibri" w:hAnsi="Calibri"/>
@@ -111,7 +111,7 @@
         </w:rPr>
         <w:t xml:space="preserve"> | GitHub: </w:t>
       </w:r>
-      <w:hyperlink w:history="1" r:id="rIdapuf7mo23wwsihvwkfvwj">
+      <w:hyperlink w:history="1" r:id="rIdt1g1wj-xzonlq-j23yl_m">
         <w:r>
           <w:rPr>
             <w:rFonts w:ascii="Calibri" w:cs="Calibri" w:eastAsia="Calibri" w:hAnsi="Calibri"/>
@@ -137,7 +137,7 @@
         </w:rPr>
         <w:t xml:space="preserve">Portfolio: </w:t>
       </w:r>
-      <w:hyperlink w:history="1" r:id="rIdqa5o2gniexypif7gkawox">
+      <w:hyperlink w:history="1" r:id="rIdx9a7erqsg_vdufvtd7zep">
         <w:r>
           <w:rPr>
             <w:rFonts w:ascii="Calibri" w:cs="Calibri" w:eastAsia="Calibri" w:hAnsi="Calibri"/>
@@ -645,7 +645,7 @@
         </w:rPr>
         <w:t xml:space="preserve">Link: </w:t>
       </w:r>
-      <w:hyperlink w:history="1" r:id="rIdil5w_iahxorx0vsqxlooc">
+      <w:hyperlink w:history="1" r:id="rIdxbe3zhydatilwpndx1s2s">
         <w:r>
           <w:rPr>
             <w:rFonts w:ascii="Calibri" w:cs="Calibri" w:eastAsia="Calibri" w:hAnsi="Calibri"/>
@@ -785,7 +785,7 @@
         </w:rPr>
         <w:t xml:space="preserve">Link: </w:t>
       </w:r>
-      <w:hyperlink w:history="1" r:id="rId5cvvtpwpyzdouutfvzhbn">
+      <w:hyperlink w:history="1" r:id="rId_gs2zsdj3hc3_o6i6pcsa">
         <w:r>
           <w:rPr>
             <w:rFonts w:ascii="Calibri" w:cs="Calibri" w:eastAsia="Calibri" w:hAnsi="Calibri"/>
@@ -889,7 +889,7 @@
         </w:rPr>
         <w:t xml:space="preserve">Link: </w:t>
       </w:r>
-      <w:hyperlink w:history="1" r:id="rId9y7yzhztjlyalgvn6xgl0">
+      <w:hyperlink w:history="1" r:id="rId8zg4ycelyltwzkorx-zji">
         <w:r>
           <w:rPr>
             <w:rFonts w:ascii="Calibri" w:cs="Calibri" w:eastAsia="Calibri" w:hAnsi="Calibri"/>
@@ -909,7 +909,7 @@
         </w:rPr>
         <w:t xml:space="preserve"> | </w:t>
       </w:r>
-      <w:hyperlink w:history="1" r:id="rIdw7rjkq3cxbqtdb9kugbnr">
+      <w:hyperlink w:history="1" r:id="rIdlx7tvl4c8gzmkke9cuc59">
         <w:r>
           <w:rPr>
             <w:rFonts w:ascii="Calibri" w:cs="Calibri" w:eastAsia="Calibri" w:hAnsi="Calibri"/>
@@ -995,7 +995,7 @@
         </w:rPr>
         <w:t xml:space="preserve">Link: </w:t>
       </w:r>
-      <w:hyperlink w:history="1" r:id="rId5p8rln93q3hkydscfatgg">
+      <w:hyperlink w:history="1" r:id="rIdcizr6fbi-_lfpi_ilbzt1">
         <w:r>
           <w:rPr>
             <w:rFonts w:ascii="Calibri" w:cs="Calibri" w:eastAsia="Calibri" w:hAnsi="Calibri"/>
@@ -1081,7 +1081,7 @@
         </w:rPr>
         <w:t xml:space="preserve">Link: </w:t>
       </w:r>
-      <w:hyperlink w:history="1" r:id="rIdeu8ucbjs4tillg6_xayjy">
+      <w:hyperlink w:history="1" r:id="rIdnjxgyfrp8cipksabobwuk">
         <w:r>
           <w:rPr>
             <w:rFonts w:ascii="Calibri" w:cs="Calibri" w:eastAsia="Calibri" w:hAnsi="Calibri"/>
@@ -1101,7 +1101,7 @@
         </w:rPr>
         <w:t xml:space="preserve"> | </w:t>
       </w:r>
-      <w:hyperlink w:history="1" r:id="rId7uq7pwqnqm_m2dnruoxfb">
+      <w:hyperlink w:history="1" r:id="rIdxjkuvl7tfhu1spporphgd">
         <w:r>
           <w:rPr>
             <w:rFonts w:ascii="Calibri" w:cs="Calibri" w:eastAsia="Calibri" w:hAnsi="Calibri"/>
@@ -1159,7 +1159,7 @@
         </w:numPr>
         <w:spacing w:after="30"/>
       </w:pPr>
-      <w:hyperlink w:history="1" r:id="rIdgmsgjvtk1tnmmj9uvdrw5">
+      <w:hyperlink w:history="1" r:id="rId7fofosmvszeh6q2eqsmt9">
         <w:r>
           <w:rPr>
             <w:rFonts w:ascii="Calibri" w:cs="Calibri" w:eastAsia="Calibri" w:hAnsi="Calibri"/>
@@ -1189,7 +1189,7 @@
         </w:numPr>
         <w:spacing w:after="30"/>
       </w:pPr>
-      <w:hyperlink w:history="1" r:id="rIdrl8twrbjpuvfyla763qgm">
+      <w:hyperlink w:history="1" r:id="rId2fvymzap4ddr8qaymiq5m">
         <w:r>
           <w:rPr>
             <w:rFonts w:ascii="Calibri" w:cs="Calibri" w:eastAsia="Calibri" w:hAnsi="Calibri"/>
@@ -1219,7 +1219,7 @@
         </w:numPr>
         <w:spacing w:after="30"/>
       </w:pPr>
-      <w:hyperlink w:history="1" r:id="rIdyla3cg75whl8ind50u3h2">
+      <w:hyperlink w:history="1" r:id="rIdondlce7p9m67hkkmx-ft6">
         <w:r>
           <w:rPr>
             <w:rFonts w:ascii="Calibri" w:cs="Calibri" w:eastAsia="Calibri" w:hAnsi="Calibri"/>
@@ -1272,7 +1272,7 @@
         </w:rPr>
         <w:t xml:space="preserve">All projects: </w:t>
       </w:r>
-      <w:hyperlink w:history="1" r:id="rIduoaa2ppgz_lm2wwee_kdp">
+      <w:hyperlink w:history="1" r:id="rIdayjzjoagcdmttj2risufv">
         <w:r>
           <w:rPr>
             <w:rFonts w:ascii="Calibri" w:cs="Calibri" w:eastAsia="Calibri" w:hAnsi="Calibri"/>
@@ -1583,7 +1583,7 @@
           <w:sz w:val="21"/>
           <w:szCs w:val="21"/>
         </w:rPr>
-        <w:t xml:space="preserve">Dr. Kokila Ramanayake</w:t>
+        <w:t xml:space="preserve">Dr. Kokila Ramanayaka</w:t>
       </w:r>
     </w:p>
     <w:p>

</xml_diff>